<commit_message>
Lab 3 maya clean up
</commit_message>
<xml_diff>
--- a/DAGV1700/Unit 3 Lab and Challenge.docx
+++ b/DAGV1700/Unit 3 Lab and Challenge.docx
@@ -44,7 +44,6 @@
       <w:r>
         <w:t> showing </w:t>
       </w:r>
-      <w:proofErr w:type="spellStart"/>
       <w:r>
         <w:rPr>
           <w:b/>
@@ -52,11 +51,9 @@
         </w:rPr>
         <w:t>DynamicCube</w:t>
       </w:r>
-      <w:proofErr w:type="spellEnd"/>
       <w:r>
         <w:t> with </w:t>
       </w:r>
-      <w:proofErr w:type="spellStart"/>
       <w:r>
         <w:rPr>
           <w:b/>
@@ -64,7 +61,6 @@
         </w:rPr>
         <w:t>Rigidbody</w:t>
       </w:r>
-      <w:proofErr w:type="spellEnd"/>
       <w:r>
         <w:t>.</w:t>
       </w:r>
@@ -144,7 +140,6 @@
       <w:r>
         <w:t> of </w:t>
       </w:r>
-      <w:proofErr w:type="spellStart"/>
       <w:r>
         <w:rPr>
           <w:b/>
@@ -152,25 +147,15 @@
         </w:rPr>
         <w:t>TriggerZone</w:t>
       </w:r>
-      <w:proofErr w:type="spellEnd"/>
       <w:r>
         <w:t> showing </w:t>
       </w:r>
-      <w:proofErr w:type="spellStart"/>
       <w:r>
         <w:rPr>
           <w:b/>
           <w:bCs/>
         </w:rPr>
-        <w:t>BoxCollider</w:t>
-      </w:r>
-      <w:proofErr w:type="spellEnd"/>
-      <w:r>
-        <w:rPr>
-          <w:b/>
-          <w:bCs/>
-        </w:rPr>
-        <w:t xml:space="preserve"> (Is Trigger)</w:t>
+        <w:t>BoxCollider (Is Trigger)</w:t>
       </w:r>
       <w:r>
         <w:t> and your custom script.</w:t>
@@ -242,7 +227,6 @@
       <w:r>
         <w:t> The moment </w:t>
       </w:r>
-      <w:proofErr w:type="spellStart"/>
       <w:r>
         <w:rPr>
           <w:b/>
@@ -250,11 +234,9 @@
         </w:rPr>
         <w:t>DynamicCube</w:t>
       </w:r>
-      <w:proofErr w:type="spellEnd"/>
       <w:r>
         <w:t> enters </w:t>
       </w:r>
-      <w:proofErr w:type="spellStart"/>
       <w:r>
         <w:rPr>
           <w:b/>
@@ -262,7 +244,6 @@
         </w:rPr>
         <w:t>TriggerZone</w:t>
       </w:r>
-      <w:proofErr w:type="spellEnd"/>
       <w:r>
         <w:t> (Console visible or color change/particles).</w:t>
       </w:r>
@@ -362,85 +343,13 @@
           <w:b/>
           <w:bCs/>
         </w:rPr>
-        <w:t xml:space="preserve">This lab was </w:t>
-      </w:r>
-      <w:proofErr w:type="gramStart"/>
-      <w:r>
-        <w:rPr>
-          <w:b/>
-          <w:bCs/>
-        </w:rPr>
-        <w:t>pretty fun</w:t>
-      </w:r>
-      <w:proofErr w:type="gramEnd"/>
-      <w:r>
-        <w:rPr>
-          <w:b/>
-          <w:bCs/>
-        </w:rPr>
-        <w:t>.</w:t>
-      </w:r>
-      <w:r>
-        <w:t xml:space="preserve"> Did a ton of experimenting and </w:t>
-      </w:r>
-      <w:proofErr w:type="gramStart"/>
-      <w:r>
-        <w:t>pushing</w:t>
-      </w:r>
-      <w:proofErr w:type="gramEnd"/>
-      <w:r>
-        <w:t xml:space="preserve"> myself. I couldn’t figure out how to do the </w:t>
-      </w:r>
-      <w:proofErr w:type="spellStart"/>
-      <w:r>
-        <w:t>MonoBehavior</w:t>
-      </w:r>
-      <w:proofErr w:type="spellEnd"/>
-      <w:r>
-        <w:t xml:space="preserve">, but I figured out how to make all the things happen with the “Simple Trigger Event”. I started out </w:t>
-      </w:r>
-      <w:proofErr w:type="gramStart"/>
-      <w:r>
-        <w:t>pretty frustrated</w:t>
-      </w:r>
-      <w:proofErr w:type="gramEnd"/>
-      <w:r>
-        <w:t xml:space="preserve"> that I couldn’t do the </w:t>
-      </w:r>
-      <w:proofErr w:type="spellStart"/>
-      <w:r>
-        <w:t>MonoBehavior</w:t>
-      </w:r>
-      <w:proofErr w:type="spellEnd"/>
-      <w:r>
-        <w:t>, but watching the video, I decided the Simple Trigger Event was how I was going to do it. I figured out how to send the “Triggered!” message</w:t>
-      </w:r>
-      <w:r>
-        <w:t xml:space="preserve">, initially attaching it to the </w:t>
-      </w:r>
-      <w:proofErr w:type="spellStart"/>
-      <w:r>
-        <w:t>DynamicCube</w:t>
-      </w:r>
-      <w:proofErr w:type="spellEnd"/>
-      <w:r>
-        <w:t xml:space="preserve">. I then added the particle burst and </w:t>
-      </w:r>
-      <w:proofErr w:type="gramStart"/>
-      <w:r>
-        <w:t>change</w:t>
-      </w:r>
-      <w:proofErr w:type="gramEnd"/>
-      <w:r>
-        <w:t xml:space="preserve"> the color too. I then realized that the assignment wanted the “Triggered!” output to be attached to the </w:t>
-      </w:r>
-      <w:proofErr w:type="spellStart"/>
-      <w:r>
-        <w:t>TriggerZone</w:t>
-      </w:r>
-      <w:proofErr w:type="spellEnd"/>
-      <w:r>
-        <w:t>, so that was an easy fix. The Dynamic Cube fell through the ground, so I had to adjust that like on the sample video. It was a very simple finished product, but man this was rewarding.</w:t>
+        <w:t>This lab was pretty fun.</w:t>
+      </w:r>
+      <w:r>
+        <w:t xml:space="preserve"> Did a ton of experimenting and pushing myself. I couldn’t figure out how to do the MonoBehavior, but I figured out how to make all the things happen with the “Simple Trigger Event”. I started out pretty frustrated that I couldn’t do the MonoBehavior, but watching the video, I decided the Simple Trigger Event was how I was going to do it. I figured out how to send the “Triggered!” message</w:t>
+      </w:r>
+      <w:r>
+        <w:t>, initially attaching it to the DynamicCube. I then added the particle burst and change the color too. I then realized that the assignment wanted the “Triggered!” output to be attached to the TriggerZone, so that was an easy fix. The Dynamic Cube fell through the ground, so I had to adjust that like on the sample video. It was a very simple finished product, but man this was rewarding.</w:t>
       </w:r>
     </w:p>
     <w:p>
@@ -464,7 +373,17 @@
         <w:t> Link to your fork of the Essentials repo containing your commits for this lab.</w:t>
       </w:r>
     </w:p>
-    <w:p/>
+    <w:p>
+      <w:pPr>
+        <w:numPr>
+          <w:ilvl w:val="1"/>
+          <w:numId w:val="1"/>
+        </w:numPr>
+      </w:pPr>
+      <w:r>
+        <w:t>https://github.com/richar65/Essentials/</w:t>
+      </w:r>
+    </w:p>
     <w:sectPr>
       <w:pgSz w:w="12240" w:h="15840"/>
       <w:pgMar w:top="1440" w:right="1440" w:bottom="1440" w:left="1440" w:header="720" w:footer="720" w:gutter="0"/>

</xml_diff>